<commit_message>
Remove household random effect from GLMMs when the outcome is the alternative vaccination status definition
</commit_message>
<xml_diff>
--- a/analysis_report/eliminate_rabies_trial_analysis_report_v1.0.docx
+++ b/analysis_report/eliminate_rabies_trial_analysis_report_v1.0.docx
@@ -123,12 +123,6 @@
           <w:szCs w:val="20"/>
         </w:rPr>
         <w:br/>
-      </w:r>
-      <w:r>
-        <w:rPr>
-          <w:sz w:val="20"/>
-          <w:szCs w:val="20"/>
-        </w:rPr>
         <w:t xml:space="preserve">Sat Mar 28 17:50:18 2026 </w:t>
       </w:r>
     </w:p>
@@ -891,28 +885,14 @@
                 <w:szCs w:val="18"/>
               </w:rPr>
               <w:br/>
-            </w:r>
-            <w:proofErr w:type="spellStart"/>
-            <w:r>
-              <w:rPr>
-                <w:sz w:val="18"/>
-                <w:szCs w:val="18"/>
-              </w:rPr>
               <w:t>Rorya</w:t>
             </w:r>
-            <w:proofErr w:type="spellEnd"/>
             <w:r>
               <w:rPr>
                 <w:sz w:val="18"/>
                 <w:szCs w:val="18"/>
               </w:rPr>
               <w:br/>
-            </w:r>
-            <w:r>
-              <w:rPr>
-                <w:sz w:val="18"/>
-                <w:szCs w:val="18"/>
-              </w:rPr>
               <w:t>Serengeti</w:t>
             </w:r>
             <w:r>
@@ -1798,12 +1778,6 @@
                 <w:szCs w:val="18"/>
               </w:rPr>
               <w:br/>
-            </w:r>
-            <w:r>
-              <w:rPr>
-                <w:sz w:val="18"/>
-                <w:szCs w:val="18"/>
-              </w:rPr>
               <w:t>[100, 4891]</w:t>
             </w:r>
           </w:p>
@@ -2264,14 +2238,7 @@
                 <w:sz w:val="18"/>
                 <w:szCs w:val="18"/>
               </w:rPr>
-              <w:t xml:space="preserve"> </w:t>
-            </w:r>
-            <w:r>
-              <w:rPr>
-                <w:sz w:val="18"/>
-                <w:szCs w:val="18"/>
-              </w:rPr>
-              <w:t xml:space="preserve">Primary analysis and secondary analysis 1. Coverage and intervention odds ratio estimates (95% CI) at each survey estimated from the GLMM reported in the previous table. </w:t>
+              <w:t xml:space="preserve"> Primary analysis and secondary analysis 1. Coverage and intervention odds ratio estimates (95% CI) at each survey estimated from the GLMM reported in the previous table. </w:t>
             </w:r>
             <w:r>
               <w:rPr>
@@ -2303,14 +2270,7 @@
                 <w:sz w:val="18"/>
                 <w:szCs w:val="18"/>
               </w:rPr>
-              <w:t>-value across all years were estimated fr</w:t>
-            </w:r>
-            <w:r>
-              <w:rPr>
-                <w:sz w:val="18"/>
-                <w:szCs w:val="18"/>
-              </w:rPr>
-              <w:t>om 10000 parametric bootstrap samples. Population: all dogs with primary outcome data.</w:t>
+              <w:t>-value across all years were estimated from 10000 parametric bootstrap samples. Population: all dogs with primary outcome data.</w:t>
             </w:r>
           </w:p>
         </w:tc>
@@ -2838,12 +2798,6 @@
                 <w:szCs w:val="18"/>
               </w:rPr>
               <w:br/>
-            </w:r>
-            <w:r>
-              <w:rPr>
-                <w:sz w:val="18"/>
-                <w:szCs w:val="18"/>
-              </w:rPr>
               <w:t>Y2-V2</w:t>
             </w:r>
             <w:r>
@@ -3581,14 +3535,7 @@
                 <w:sz w:val="18"/>
                 <w:szCs w:val="18"/>
               </w:rPr>
-              <w:t xml:space="preserve"> </w:t>
-            </w:r>
-            <w:r>
-              <w:rPr>
-                <w:sz w:val="18"/>
-                <w:szCs w:val="18"/>
-              </w:rPr>
-              <w:t>Secondary analysis 2. Estimated probability (95% CI) of village-level coverage below 40% by month and averaged over the trial year, for each trial arm. The distribution of coverage among villages was estimated from 10000 parametric bootstrap samples. Population: all dogs with primary outcome data.</w:t>
+              <w:t xml:space="preserve"> Secondary analysis 2. Estimated probability (95% CI) of village-level coverage below 40% by month and averaged over the trial year, for each trial arm. The distribution of coverage among villages was estimated from 10000 parametric bootstrap samples. Population: all dogs with primary outcome data.</w:t>
             </w:r>
           </w:p>
         </w:tc>
@@ -3678,14 +3625,7 @@
                 <w:sz w:val="18"/>
                 <w:szCs w:val="18"/>
               </w:rPr>
-              <w:t>Coverag</w:t>
-            </w:r>
-            <w:r>
-              <w:rPr>
-                <w:sz w:val="18"/>
-                <w:szCs w:val="18"/>
-              </w:rPr>
-              <w:t>e</w:t>
+              <w:t>Coverage</w:t>
             </w:r>
           </w:p>
         </w:tc>
@@ -3997,12 +3937,6 @@
                 <w:szCs w:val="18"/>
               </w:rPr>
               <w:br/>
-            </w:r>
-            <w:r>
-              <w:rPr>
-                <w:sz w:val="18"/>
-                <w:szCs w:val="18"/>
-              </w:rPr>
               <w:t>0.63 (0.38, 0.86)</w:t>
             </w:r>
             <w:r>
@@ -4359,14 +4293,7 @@
                 <w:sz w:val="18"/>
                 <w:szCs w:val="18"/>
               </w:rPr>
-              <w:t xml:space="preserve"> Seconda</w:t>
-            </w:r>
-            <w:r>
-              <w:rPr>
-                <w:sz w:val="18"/>
-                <w:szCs w:val="18"/>
-              </w:rPr>
-              <w:t xml:space="preserve">ry analyses 3 and 4. Estimated median (95% CI) </w:t>
+              <w:t xml:space="preserve"> Secondary analyses 3 and 4. Estimated median (95% CI) </w:t>
             </w:r>
             <w:proofErr w:type="spellStart"/>
             <w:r>
@@ -4979,21 +4906,7 @@
                 <w:sz w:val="18"/>
                 <w:szCs w:val="18"/>
               </w:rPr>
-              <w:t xml:space="preserve"> </w:t>
-            </w:r>
-            <w:r>
-              <w:rPr>
-                <w:sz w:val="18"/>
-                <w:szCs w:val="18"/>
-              </w:rPr>
-              <w:t>Secondary analysis 6. Estimate (95% CI) of V2:V1 odds ratios and of minimum coverage at visit 1 required for coverage at visit 2 to exceed 40%, by trial arm. V2:V1 odds ratios differed significantly between trial arms (interaction P</w:t>
-            </w:r>
-            <w:r>
-              <w:rPr>
-                <w:sz w:val="18"/>
-                <w:szCs w:val="18"/>
-              </w:rPr>
-              <w:t xml:space="preserve"> </w:t>
+              <w:t xml:space="preserve"> Secondary analysis 6. Estimate (95% CI) of V2:V1 odds ratios and of minimum coverage at visit 1 required for coverage at visit 2 to exceed 40%, by trial arm. V2:V1 odds ratios differed significantly between trial arms (interaction P </w:t>
             </w:r>
           </w:p>
         </w:tc>
@@ -13233,15 +13146,7 @@
                 <w:sz w:val="14"/>
                 <w:szCs w:val="14"/>
               </w:rPr>
-              <w:t>-</w:t>
-            </w:r>
-            <w:r>
-              <w:rPr>
-                <w:rFonts w:eastAsia="Times New Roman"/>
-                <w:sz w:val="14"/>
-                <w:szCs w:val="14"/>
-              </w:rPr>
-              <w:t>0.50, 1.22</w:t>
+              <w:t>-0.50, 1.22</w:t>
             </w:r>
           </w:p>
         </w:tc>
@@ -14099,15 +14004,7 @@
                 <w:sz w:val="14"/>
                 <w:szCs w:val="14"/>
               </w:rPr>
-              <w:t>-</w:t>
-            </w:r>
-            <w:r>
-              <w:rPr>
-                <w:rFonts w:eastAsia="Times New Roman"/>
-                <w:sz w:val="14"/>
-                <w:szCs w:val="14"/>
-              </w:rPr>
-              <w:t>1.61, -0.26</w:t>
+              <w:t>-1.61, -0.26</w:t>
             </w:r>
           </w:p>
         </w:tc>
@@ -17519,14 +17416,7 @@
                 <w:sz w:val="18"/>
                 <w:szCs w:val="18"/>
               </w:rPr>
-              <w:t xml:space="preserve"> </w:t>
-            </w:r>
-            <w:r>
-              <w:rPr>
-                <w:sz w:val="18"/>
-                <w:szCs w:val="18"/>
-              </w:rPr>
-              <w:t>Characteristics of surveyed dogs, overall and by trial arm. Population: all dogs.</w:t>
+              <w:t xml:space="preserve"> Characteristics of surveyed dogs, overall and by trial arm. Population: all dogs.</w:t>
             </w:r>
           </w:p>
         </w:tc>
@@ -18030,14 +17920,7 @@
                 <w:szCs w:val="18"/>
               </w:rPr>
               <w:br/>
-              <w:t>3.0 </w:t>
-            </w:r>
-            <w:r>
-              <w:rPr>
-                <w:sz w:val="18"/>
-                <w:szCs w:val="18"/>
-              </w:rPr>
-              <w:t>(1.0, 4.0)</w:t>
+              <w:t>3.0 (1.0, 4.0)</w:t>
             </w:r>
             <w:r>
               <w:rPr>
@@ -19248,12 +19131,6 @@
                 <w:szCs w:val="18"/>
               </w:rPr>
               <w:br/>
-            </w:r>
-            <w:r>
-              <w:rPr>
-                <w:sz w:val="18"/>
-                <w:szCs w:val="18"/>
-              </w:rPr>
               <w:t>Not vaccinated</w:t>
             </w:r>
             <w:r>
@@ -19523,14 +19400,7 @@
                 <w:sz w:val="18"/>
                 <w:szCs w:val="18"/>
               </w:rPr>
-              <w:t xml:space="preserve"> </w:t>
-            </w:r>
-            <w:r>
-              <w:rPr>
-                <w:sz w:val="18"/>
-                <w:szCs w:val="18"/>
-              </w:rPr>
-              <w:t>Moran's test for spatial autocorrelation in the residuals of the primary analysis full model, applied at a range of spatial scales defined by the number of nearest neighbours (</w:t>
+              <w:t xml:space="preserve"> Moran's test for spatial autocorrelation in the residuals of the primary analysis full model, applied at a range of spatial scales defined by the number of nearest neighbours (</w:t>
             </w:r>
             <w:proofErr w:type="spellStart"/>
             <w:r>
@@ -19862,12 +19732,6 @@
                 <w:szCs w:val="18"/>
               </w:rPr>
               <w:br/>
-            </w:r>
-            <w:r>
-              <w:rPr>
-                <w:sz w:val="18"/>
-                <w:szCs w:val="18"/>
-              </w:rPr>
               <w:t>-0.14</w:t>
             </w:r>
             <w:r>
@@ -20069,21 +19933,7 @@
           <w:sz w:val="20"/>
           <w:szCs w:val="20"/>
         </w:rPr>
-        <w:instrText xml:space="preserve"> </w:instrText>
-      </w:r>
-      <w:r>
-        <w:rPr>
-          <w:sz w:val="20"/>
-          <w:szCs w:val="20"/>
-        </w:rPr>
-        <w:instrText>INCLUDEPICTURE  \d "/Users/pauljohnson/Library/CloudStorage/OneDrive-UniversityofGlasgow/Projects/thermotolerance/EliminateRabiesTrial/analysis_report/eliminate_rabies_trial_analysis_report_v1.0_figures/figure02.tiff" \* MERGEFORMATINET</w:instrText>
-      </w:r>
-      <w:r>
-        <w:rPr>
-          <w:sz w:val="20"/>
-          <w:szCs w:val="20"/>
-        </w:rPr>
-        <w:instrText xml:space="preserve"> </w:instrText>
+        <w:instrText xml:space="preserve"> INCLUDEPICTURE  \d "/Users/pauljohnson/Library/CloudStorage/OneDrive-UniversityofGlasgow/Projects/thermotolerance/EliminateRabiesTrial/analysis_report/eliminate_rabies_trial_analysis_report_v1.0_figures/figure02.tiff" \* MERGEFORMATINET </w:instrText>
       </w:r>
       <w:r>
         <w:rPr>
@@ -20215,21 +20065,7 @@
           <w:sz w:val="20"/>
           <w:szCs w:val="20"/>
         </w:rPr>
-        <w:instrText xml:space="preserve"> </w:instrText>
-      </w:r>
-      <w:r>
-        <w:rPr>
-          <w:sz w:val="20"/>
-          <w:szCs w:val="20"/>
-        </w:rPr>
-        <w:instrText>INCLUDEPICTURE  \d "/Users/pauljohnson/Library/CloudStorage/OneDrive-UniversityofGlasgow/Projects/thermotolerance/EliminateRabiesTrial/analysis_report/eliminate_rabies_trial_analysis_report_v1.0_figures/figure03.tiff" \* MERGEFORMATINET</w:instrText>
-      </w:r>
-      <w:r>
-        <w:rPr>
-          <w:sz w:val="20"/>
-          <w:szCs w:val="20"/>
-        </w:rPr>
-        <w:instrText xml:space="preserve"> </w:instrText>
+        <w:instrText xml:space="preserve"> INCLUDEPICTURE  \d "/Users/pauljohnson/Library/CloudStorage/OneDrive-UniversityofGlasgow/Projects/thermotolerance/EliminateRabiesTrial/analysis_report/eliminate_rabies_trial_analysis_report_v1.0_figures/figure03.tiff" \* MERGEFORMATINET </w:instrText>
       </w:r>
       <w:r>
         <w:rPr>
@@ -20361,21 +20197,7 @@
           <w:sz w:val="20"/>
           <w:szCs w:val="20"/>
         </w:rPr>
-        <w:instrText xml:space="preserve"> </w:instrText>
-      </w:r>
-      <w:r>
-        <w:rPr>
-          <w:sz w:val="20"/>
-          <w:szCs w:val="20"/>
-        </w:rPr>
-        <w:instrText>INCLUDEPICTURE  \d "/Users/pauljohnson/Library/CloudStorage/OneDrive-UniversityofGlasgow/Projects/thermotolerance/EliminateRabiesTrial/analysis_report/eliminate_rabies_trial_analysis_report_v1.0_figures/figure04.tiff" \* MERGEFORMATINET</w:instrText>
-      </w:r>
-      <w:r>
-        <w:rPr>
-          <w:sz w:val="20"/>
-          <w:szCs w:val="20"/>
-        </w:rPr>
-        <w:instrText xml:space="preserve"> </w:instrText>
+        <w:instrText xml:space="preserve"> INCLUDEPICTURE  \d "/Users/pauljohnson/Library/CloudStorage/OneDrive-UniversityofGlasgow/Projects/thermotolerance/EliminateRabiesTrial/analysis_report/eliminate_rabies_trial_analysis_report_v1.0_figures/figure04.tiff" \* MERGEFORMATINET </w:instrText>
       </w:r>
       <w:r>
         <w:rPr>
@@ -20507,21 +20329,7 @@
           <w:sz w:val="20"/>
           <w:szCs w:val="20"/>
         </w:rPr>
-        <w:instrText xml:space="preserve"> </w:instrText>
-      </w:r>
-      <w:r>
-        <w:rPr>
-          <w:sz w:val="20"/>
-          <w:szCs w:val="20"/>
-        </w:rPr>
-        <w:instrText>INCLUDEPICTURE  \d "/Users/pauljohnson/Library/CloudStorage/OneDrive-UniversityofGlasgow/Projects/thermotolerance/EliminateRabiesTrial/analysis_report/eliminate_rabies_trial_analysis_report_v1.0_figures/figure05.tiff" \* MERGEFORMATINET</w:instrText>
-      </w:r>
-      <w:r>
-        <w:rPr>
-          <w:sz w:val="20"/>
-          <w:szCs w:val="20"/>
-        </w:rPr>
-        <w:instrText xml:space="preserve"> </w:instrText>
+        <w:instrText xml:space="preserve"> INCLUDEPICTURE  \d "/Users/pauljohnson/Library/CloudStorage/OneDrive-UniversityofGlasgow/Projects/thermotolerance/EliminateRabiesTrial/analysis_report/eliminate_rabies_trial_analysis_report_v1.0_figures/figure05.tiff" \* MERGEFORMATINET </w:instrText>
       </w:r>
       <w:r>
         <w:rPr>
@@ -20684,21 +20492,7 @@
           <w:sz w:val="20"/>
           <w:szCs w:val="20"/>
         </w:rPr>
-        <w:instrText xml:space="preserve"> </w:instrText>
-      </w:r>
-      <w:r>
-        <w:rPr>
-          <w:sz w:val="20"/>
-          <w:szCs w:val="20"/>
-        </w:rPr>
-        <w:instrText>INCLUDEPICTURE  \d "/Users/pauljohnson/Library/CloudStorage/OneDrive-UniversityofGlasgow/Projects/thermotolerance/EliminateRabiesTrial/analysis_report/eliminate_rabies_trial_analysis_report_v1.0_figures/figureS1.tiff" \* MERGEFORMATINET</w:instrText>
-      </w:r>
-      <w:r>
-        <w:rPr>
-          <w:sz w:val="20"/>
-          <w:szCs w:val="20"/>
-        </w:rPr>
-        <w:instrText xml:space="preserve"> </w:instrText>
+        <w:instrText xml:space="preserve"> INCLUDEPICTURE  \d "/Users/pauljohnson/Library/CloudStorage/OneDrive-UniversityofGlasgow/Projects/thermotolerance/EliminateRabiesTrial/analysis_report/eliminate_rabies_trial_analysis_report_v1.0_figures/figureS1.tiff" \* MERGEFORMATINET </w:instrText>
       </w:r>
       <w:r>
         <w:rPr>
@@ -20829,21 +20623,7 @@
           <w:sz w:val="20"/>
           <w:szCs w:val="20"/>
         </w:rPr>
-        <w:instrText xml:space="preserve"> </w:instrText>
-      </w:r>
-      <w:r>
-        <w:rPr>
-          <w:sz w:val="20"/>
-          <w:szCs w:val="20"/>
-        </w:rPr>
-        <w:instrText>INCLUDEPICTURE  \d "/Users/pauljohnson/Library/CloudStorage/OneDrive-UniversityofGlasgow/Projects/thermotolerance/EliminateRabiesTrial/analysis_report/eliminate_rabies_trial_analysis_report_v1.0_figures/figureS2.tiff" \* MERGEFORMATINET</w:instrText>
-      </w:r>
-      <w:r>
-        <w:rPr>
-          <w:sz w:val="20"/>
-          <w:szCs w:val="20"/>
-        </w:rPr>
-        <w:instrText xml:space="preserve"> </w:instrText>
+        <w:instrText xml:space="preserve"> INCLUDEPICTURE  \d "/Users/pauljohnson/Library/CloudStorage/OneDrive-UniversityofGlasgow/Projects/thermotolerance/EliminateRabiesTrial/analysis_report/eliminate_rabies_trial_analysis_report_v1.0_figures/figureS2.tiff" \* MERGEFORMATINET </w:instrText>
       </w:r>
       <w:r>
         <w:rPr>

</xml_diff>

<commit_message>
Final run of analysis programme prior to submission of revised manuscript
</commit_message>
<xml_diff>
--- a/analysis_report/eliminate_rabies_trial_analysis_report_v1.0.docx
+++ b/analysis_report/eliminate_rabies_trial_analysis_report_v1.0.docx
@@ -123,7 +123,7 @@
           <w:szCs w:val="20"/>
         </w:rPr>
         <w:br/>
-        <w:t xml:space="preserve">Sat Mar 28 17:50:18 2026 </w:t>
+        <w:t xml:space="preserve">Wed Apr 1 10:50:08 2026 </w:t>
       </w:r>
     </w:p>
     <w:p>
@@ -3611,21 +3611,12 @@
                 <w:szCs w:val="18"/>
               </w:rPr>
             </w:pPr>
-            <w:proofErr w:type="gramStart"/>
-            <w:r>
-              <w:rPr>
-                <w:sz w:val="18"/>
-                <w:szCs w:val="18"/>
-              </w:rPr>
-              <w:t>P(</w:t>
-            </w:r>
-            <w:proofErr w:type="gramEnd"/>
-            <w:r>
-              <w:rPr>
-                <w:sz w:val="18"/>
-                <w:szCs w:val="18"/>
-              </w:rPr>
-              <w:t>Coverage</w:t>
+            <w:r>
+              <w:rPr>
+                <w:sz w:val="18"/>
+                <w:szCs w:val="18"/>
+              </w:rPr>
+              <w:t>P(Coverage&lt;0.4) (95% CI)</w:t>
             </w:r>
           </w:p>
         </w:tc>
@@ -19922,37 +19913,16 @@
       </w:pPr>
       <w:r>
         <w:rPr>
+          <w:noProof/>
           <w:sz w:val="20"/>
           <w:szCs w:val="20"/>
         </w:rPr>
         <w:lastRenderedPageBreak/>
-        <w:fldChar w:fldCharType="begin"/>
-      </w:r>
-      <w:r>
-        <w:rPr>
-          <w:sz w:val="20"/>
-          <w:szCs w:val="20"/>
-        </w:rPr>
-        <w:instrText xml:space="preserve"> INCLUDEPICTURE  \d "/Users/pauljohnson/Library/CloudStorage/OneDrive-UniversityofGlasgow/Projects/thermotolerance/EliminateRabiesTrial/analysis_report/eliminate_rabies_trial_analysis_report_v1.0_figures/figure02.tiff" \* MERGEFORMATINET </w:instrText>
-      </w:r>
-      <w:r>
-        <w:rPr>
-          <w:sz w:val="20"/>
-          <w:szCs w:val="20"/>
-        </w:rPr>
-        <w:fldChar w:fldCharType="separate"/>
-      </w:r>
-      <w:r>
-        <w:rPr>
-          <w:noProof/>
-          <w:sz w:val="20"/>
-          <w:szCs w:val="20"/>
-        </w:rPr>
         <w:drawing>
-          <wp:inline distT="0" distB="0" distL="0" distR="0" wp14:anchorId="3B36CF9E" wp14:editId="40C7C04F">
-            <wp:extent cx="4065905" cy="3302635"/>
-            <wp:effectExtent l="0" t="0" r="10795" b="12065"/>
-            <wp:docPr id="1" name="Picture 1"/>
+          <wp:inline distT="0" distB="0" distL="0" distR="0" wp14:anchorId="19A698BC" wp14:editId="0CA2B2E2">
+            <wp:extent cx="6353944" cy="5162648"/>
+            <wp:effectExtent l="0" t="0" r="0" b="0"/>
+            <wp:docPr id="2128182732" name="Picture 1"/>
             <wp:cNvGraphicFramePr>
               <a:graphicFrameLocks xmlns:a="http://schemas.openxmlformats.org/drawingml/2006/main" noChangeAspect="1"/>
             </wp:cNvGraphicFramePr>
@@ -19960,49 +19930,29 @@
               <a:graphicData uri="http://schemas.openxmlformats.org/drawingml/2006/picture">
                 <pic:pic xmlns:pic="http://schemas.openxmlformats.org/drawingml/2006/picture">
                   <pic:nvPicPr>
-                    <pic:cNvPr id="0" name="Picture 1"/>
-                    <pic:cNvPicPr>
-                      <a:picLocks noChangeAspect="1" noChangeArrowheads="1"/>
-                    </pic:cNvPicPr>
+                    <pic:cNvPr id="2128182732" name=""/>
+                    <pic:cNvPicPr/>
                   </pic:nvPicPr>
                   <pic:blipFill>
-                    <a:blip r:link="rId6">
-                      <a:extLst>
-                        <a:ext uri="{28A0092B-C50C-407E-A947-70E740481C1C}">
-                          <a14:useLocalDpi xmlns:a14="http://schemas.microsoft.com/office/drawing/2010/main" val="0"/>
-                        </a:ext>
-                      </a:extLst>
-                    </a:blip>
-                    <a:srcRect/>
+                    <a:blip r:embed="rId6"/>
                     <a:stretch>
                       <a:fillRect/>
                     </a:stretch>
                   </pic:blipFill>
-                  <pic:spPr bwMode="auto">
+                  <pic:spPr>
                     <a:xfrm>
                       <a:off x="0" y="0"/>
-                      <a:ext cx="4065905" cy="3302635"/>
+                      <a:ext cx="6415643" cy="5212779"/>
                     </a:xfrm>
                     <a:prstGeom prst="rect">
                       <a:avLst/>
                     </a:prstGeom>
-                    <a:noFill/>
-                    <a:ln>
-                      <a:noFill/>
-                    </a:ln>
                   </pic:spPr>
                 </pic:pic>
               </a:graphicData>
             </a:graphic>
           </wp:inline>
         </w:drawing>
-      </w:r>
-      <w:r>
-        <w:rPr>
-          <w:sz w:val="20"/>
-          <w:szCs w:val="20"/>
-        </w:rPr>
-        <w:fldChar w:fldCharType="end"/>
       </w:r>
       <w:r>
         <w:rPr>
@@ -20054,37 +20004,16 @@
       </w:pPr>
       <w:r>
         <w:rPr>
+          <w:noProof/>
           <w:sz w:val="20"/>
           <w:szCs w:val="20"/>
         </w:rPr>
         <w:lastRenderedPageBreak/>
-        <w:fldChar w:fldCharType="begin"/>
-      </w:r>
-      <w:r>
-        <w:rPr>
-          <w:sz w:val="20"/>
-          <w:szCs w:val="20"/>
-        </w:rPr>
-        <w:instrText xml:space="preserve"> INCLUDEPICTURE  \d "/Users/pauljohnson/Library/CloudStorage/OneDrive-UniversityofGlasgow/Projects/thermotolerance/EliminateRabiesTrial/analysis_report/eliminate_rabies_trial_analysis_report_v1.0_figures/figure03.tiff" \* MERGEFORMATINET </w:instrText>
-      </w:r>
-      <w:r>
-        <w:rPr>
-          <w:sz w:val="20"/>
-          <w:szCs w:val="20"/>
-        </w:rPr>
-        <w:fldChar w:fldCharType="separate"/>
-      </w:r>
-      <w:r>
-        <w:rPr>
-          <w:noProof/>
-          <w:sz w:val="20"/>
-          <w:szCs w:val="20"/>
-        </w:rPr>
         <w:drawing>
-          <wp:inline distT="0" distB="0" distL="0" distR="0" wp14:anchorId="4A295D5B" wp14:editId="2FEF50EA">
-            <wp:extent cx="3997960" cy="3430905"/>
-            <wp:effectExtent l="0" t="0" r="2540" b="10795"/>
-            <wp:docPr id="2" name="Picture 2"/>
+          <wp:inline distT="0" distB="0" distL="0" distR="0" wp14:anchorId="1BA72219" wp14:editId="6729F534">
+            <wp:extent cx="5417680" cy="4646832"/>
+            <wp:effectExtent l="0" t="0" r="5715" b="1905"/>
+            <wp:docPr id="1277795003" name="Picture 1"/>
             <wp:cNvGraphicFramePr>
               <a:graphicFrameLocks xmlns:a="http://schemas.openxmlformats.org/drawingml/2006/main" noChangeAspect="1"/>
             </wp:cNvGraphicFramePr>
@@ -20092,49 +20021,29 @@
               <a:graphicData uri="http://schemas.openxmlformats.org/drawingml/2006/picture">
                 <pic:pic xmlns:pic="http://schemas.openxmlformats.org/drawingml/2006/picture">
                   <pic:nvPicPr>
-                    <pic:cNvPr id="0" name="Picture 2"/>
-                    <pic:cNvPicPr>
-                      <a:picLocks noChangeAspect="1" noChangeArrowheads="1"/>
-                    </pic:cNvPicPr>
+                    <pic:cNvPr id="1277795003" name=""/>
+                    <pic:cNvPicPr/>
                   </pic:nvPicPr>
                   <pic:blipFill>
-                    <a:blip r:link="rId7">
-                      <a:extLst>
-                        <a:ext uri="{28A0092B-C50C-407E-A947-70E740481C1C}">
-                          <a14:useLocalDpi xmlns:a14="http://schemas.microsoft.com/office/drawing/2010/main" val="0"/>
-                        </a:ext>
-                      </a:extLst>
-                    </a:blip>
-                    <a:srcRect/>
+                    <a:blip r:embed="rId7"/>
                     <a:stretch>
                       <a:fillRect/>
                     </a:stretch>
                   </pic:blipFill>
-                  <pic:spPr bwMode="auto">
+                  <pic:spPr>
                     <a:xfrm>
                       <a:off x="0" y="0"/>
-                      <a:ext cx="3997960" cy="3430905"/>
+                      <a:ext cx="5444982" cy="4670250"/>
                     </a:xfrm>
                     <a:prstGeom prst="rect">
                       <a:avLst/>
                     </a:prstGeom>
-                    <a:noFill/>
-                    <a:ln>
-                      <a:noFill/>
-                    </a:ln>
                   </pic:spPr>
                 </pic:pic>
               </a:graphicData>
             </a:graphic>
           </wp:inline>
         </w:drawing>
-      </w:r>
-      <w:r>
-        <w:rPr>
-          <w:sz w:val="20"/>
-          <w:szCs w:val="20"/>
-        </w:rPr>
-        <w:fldChar w:fldCharType="end"/>
       </w:r>
       <w:r>
         <w:rPr>
@@ -20186,37 +20095,16 @@
       </w:pPr>
       <w:r>
         <w:rPr>
+          <w:noProof/>
           <w:sz w:val="20"/>
           <w:szCs w:val="20"/>
         </w:rPr>
         <w:lastRenderedPageBreak/>
-        <w:fldChar w:fldCharType="begin"/>
-      </w:r>
-      <w:r>
-        <w:rPr>
-          <w:sz w:val="20"/>
-          <w:szCs w:val="20"/>
-        </w:rPr>
-        <w:instrText xml:space="preserve"> INCLUDEPICTURE  \d "/Users/pauljohnson/Library/CloudStorage/OneDrive-UniversityofGlasgow/Projects/thermotolerance/EliminateRabiesTrial/analysis_report/eliminate_rabies_trial_analysis_report_v1.0_figures/figure04.tiff" \* MERGEFORMATINET </w:instrText>
-      </w:r>
-      <w:r>
-        <w:rPr>
-          <w:sz w:val="20"/>
-          <w:szCs w:val="20"/>
-        </w:rPr>
-        <w:fldChar w:fldCharType="separate"/>
-      </w:r>
-      <w:r>
-        <w:rPr>
-          <w:noProof/>
-          <w:sz w:val="20"/>
-          <w:szCs w:val="20"/>
-        </w:rPr>
         <w:drawing>
-          <wp:inline distT="0" distB="0" distL="0" distR="0" wp14:anchorId="0AFFE738" wp14:editId="16560A64">
-            <wp:extent cx="5078095" cy="2539365"/>
-            <wp:effectExtent l="0" t="0" r="1905" b="635"/>
-            <wp:docPr id="3" name="Picture 3"/>
+          <wp:inline distT="0" distB="0" distL="0" distR="0" wp14:anchorId="367C1CD5" wp14:editId="401CA454">
+            <wp:extent cx="7249356" cy="3624678"/>
+            <wp:effectExtent l="0" t="0" r="2540" b="0"/>
+            <wp:docPr id="1585076473" name="Picture 1"/>
             <wp:cNvGraphicFramePr>
               <a:graphicFrameLocks xmlns:a="http://schemas.openxmlformats.org/drawingml/2006/main" noChangeAspect="1"/>
             </wp:cNvGraphicFramePr>
@@ -20224,49 +20112,29 @@
               <a:graphicData uri="http://schemas.openxmlformats.org/drawingml/2006/picture">
                 <pic:pic xmlns:pic="http://schemas.openxmlformats.org/drawingml/2006/picture">
                   <pic:nvPicPr>
-                    <pic:cNvPr id="0" name="Picture 3"/>
-                    <pic:cNvPicPr>
-                      <a:picLocks noChangeAspect="1" noChangeArrowheads="1"/>
-                    </pic:cNvPicPr>
+                    <pic:cNvPr id="1585076473" name=""/>
+                    <pic:cNvPicPr/>
                   </pic:nvPicPr>
                   <pic:blipFill>
-                    <a:blip r:link="rId8">
-                      <a:extLst>
-                        <a:ext uri="{28A0092B-C50C-407E-A947-70E740481C1C}">
-                          <a14:useLocalDpi xmlns:a14="http://schemas.microsoft.com/office/drawing/2010/main" val="0"/>
-                        </a:ext>
-                      </a:extLst>
-                    </a:blip>
-                    <a:srcRect/>
+                    <a:blip r:embed="rId8"/>
                     <a:stretch>
                       <a:fillRect/>
                     </a:stretch>
                   </pic:blipFill>
-                  <pic:spPr bwMode="auto">
+                  <pic:spPr>
                     <a:xfrm>
                       <a:off x="0" y="0"/>
-                      <a:ext cx="5078095" cy="2539365"/>
+                      <a:ext cx="7305308" cy="3652654"/>
                     </a:xfrm>
                     <a:prstGeom prst="rect">
                       <a:avLst/>
                     </a:prstGeom>
-                    <a:noFill/>
-                    <a:ln>
-                      <a:noFill/>
-                    </a:ln>
                   </pic:spPr>
                 </pic:pic>
               </a:graphicData>
             </a:graphic>
           </wp:inline>
         </w:drawing>
-      </w:r>
-      <w:r>
-        <w:rPr>
-          <w:sz w:val="20"/>
-          <w:szCs w:val="20"/>
-        </w:rPr>
-        <w:fldChar w:fldCharType="end"/>
       </w:r>
       <w:r>
         <w:rPr>
@@ -20318,37 +20186,16 @@
       </w:pPr>
       <w:r>
         <w:rPr>
+          <w:noProof/>
           <w:sz w:val="20"/>
           <w:szCs w:val="20"/>
         </w:rPr>
         <w:lastRenderedPageBreak/>
-        <w:fldChar w:fldCharType="begin"/>
-      </w:r>
-      <w:r>
-        <w:rPr>
-          <w:sz w:val="20"/>
-          <w:szCs w:val="20"/>
-        </w:rPr>
-        <w:instrText xml:space="preserve"> INCLUDEPICTURE  \d "/Users/pauljohnson/Library/CloudStorage/OneDrive-UniversityofGlasgow/Projects/thermotolerance/EliminateRabiesTrial/analysis_report/eliminate_rabies_trial_analysis_report_v1.0_figures/figure05.tiff" \* MERGEFORMATINET </w:instrText>
-      </w:r>
-      <w:r>
-        <w:rPr>
-          <w:sz w:val="20"/>
-          <w:szCs w:val="20"/>
-        </w:rPr>
-        <w:fldChar w:fldCharType="separate"/>
-      </w:r>
-      <w:r>
-        <w:rPr>
-          <w:noProof/>
-          <w:sz w:val="20"/>
-          <w:szCs w:val="20"/>
-        </w:rPr>
         <w:drawing>
-          <wp:inline distT="0" distB="0" distL="0" distR="0" wp14:anchorId="7DD956E5" wp14:editId="15E794B7">
-            <wp:extent cx="4314825" cy="2539365"/>
-            <wp:effectExtent l="0" t="0" r="3175" b="635"/>
-            <wp:docPr id="4" name="Picture 4"/>
+          <wp:inline distT="0" distB="0" distL="0" distR="0" wp14:anchorId="23839527" wp14:editId="71F7F96D">
+            <wp:extent cx="6902280" cy="4059946"/>
+            <wp:effectExtent l="0" t="0" r="0" b="4445"/>
+            <wp:docPr id="1522268487" name="Picture 1"/>
             <wp:cNvGraphicFramePr>
               <a:graphicFrameLocks xmlns:a="http://schemas.openxmlformats.org/drawingml/2006/main" noChangeAspect="1"/>
             </wp:cNvGraphicFramePr>
@@ -20356,49 +20203,29 @@
               <a:graphicData uri="http://schemas.openxmlformats.org/drawingml/2006/picture">
                 <pic:pic xmlns:pic="http://schemas.openxmlformats.org/drawingml/2006/picture">
                   <pic:nvPicPr>
-                    <pic:cNvPr id="0" name="Picture 4"/>
-                    <pic:cNvPicPr>
-                      <a:picLocks noChangeAspect="1" noChangeArrowheads="1"/>
-                    </pic:cNvPicPr>
+                    <pic:cNvPr id="1522268487" name=""/>
+                    <pic:cNvPicPr/>
                   </pic:nvPicPr>
                   <pic:blipFill>
-                    <a:blip r:link="rId9">
-                      <a:extLst>
-                        <a:ext uri="{28A0092B-C50C-407E-A947-70E740481C1C}">
-                          <a14:useLocalDpi xmlns:a14="http://schemas.microsoft.com/office/drawing/2010/main" val="0"/>
-                        </a:ext>
-                      </a:extLst>
-                    </a:blip>
-                    <a:srcRect/>
+                    <a:blip r:embed="rId9"/>
                     <a:stretch>
                       <a:fillRect/>
                     </a:stretch>
                   </pic:blipFill>
-                  <pic:spPr bwMode="auto">
+                  <pic:spPr>
                     <a:xfrm>
                       <a:off x="0" y="0"/>
-                      <a:ext cx="4314825" cy="2539365"/>
+                      <a:ext cx="6931531" cy="4077152"/>
                     </a:xfrm>
                     <a:prstGeom prst="rect">
                       <a:avLst/>
                     </a:prstGeom>
-                    <a:noFill/>
-                    <a:ln>
-                      <a:noFill/>
-                    </a:ln>
                   </pic:spPr>
                 </pic:pic>
               </a:graphicData>
             </a:graphic>
           </wp:inline>
         </w:drawing>
-      </w:r>
-      <w:r>
-        <w:rPr>
-          <w:sz w:val="20"/>
-          <w:szCs w:val="20"/>
-        </w:rPr>
-        <w:fldChar w:fldCharType="end"/>
       </w:r>
       <w:r>
         <w:rPr>
@@ -20482,36 +20309,16 @@
       </w:pPr>
       <w:r>
         <w:rPr>
-          <w:sz w:val="20"/>
-          <w:szCs w:val="20"/>
-        </w:rPr>
-        <w:fldChar w:fldCharType="begin"/>
-      </w:r>
-      <w:r>
-        <w:rPr>
-          <w:sz w:val="20"/>
-          <w:szCs w:val="20"/>
-        </w:rPr>
-        <w:instrText xml:space="preserve"> INCLUDEPICTURE  \d "/Users/pauljohnson/Library/CloudStorage/OneDrive-UniversityofGlasgow/Projects/thermotolerance/EliminateRabiesTrial/analysis_report/eliminate_rabies_trial_analysis_report_v1.0_figures/figureS1.tiff" \* MERGEFORMATINET </w:instrText>
-      </w:r>
-      <w:r>
-        <w:rPr>
-          <w:sz w:val="20"/>
-          <w:szCs w:val="20"/>
-        </w:rPr>
-        <w:fldChar w:fldCharType="separate"/>
-      </w:r>
-      <w:r>
-        <w:rPr>
           <w:noProof/>
           <w:sz w:val="20"/>
           <w:szCs w:val="20"/>
         </w:rPr>
+        <w:lastRenderedPageBreak/>
         <w:drawing>
-          <wp:inline distT="0" distB="0" distL="0" distR="0" wp14:anchorId="7040FE2E" wp14:editId="0864126A">
-            <wp:extent cx="3378200" cy="2108200"/>
+          <wp:inline distT="0" distB="0" distL="0" distR="0" wp14:anchorId="202D2996" wp14:editId="3822A0D1">
+            <wp:extent cx="8257540" cy="5161280"/>
             <wp:effectExtent l="0" t="0" r="0" b="0"/>
-            <wp:docPr id="5" name="Picture 5"/>
+            <wp:docPr id="1124665155" name="Picture 1"/>
             <wp:cNvGraphicFramePr>
               <a:graphicFrameLocks xmlns:a="http://schemas.openxmlformats.org/drawingml/2006/main" noChangeAspect="1"/>
             </wp:cNvGraphicFramePr>
@@ -20519,49 +20326,29 @@
               <a:graphicData uri="http://schemas.openxmlformats.org/drawingml/2006/picture">
                 <pic:pic xmlns:pic="http://schemas.openxmlformats.org/drawingml/2006/picture">
                   <pic:nvPicPr>
-                    <pic:cNvPr id="0" name="Picture 5"/>
-                    <pic:cNvPicPr>
-                      <a:picLocks noChangeAspect="1" noChangeArrowheads="1"/>
-                    </pic:cNvPicPr>
+                    <pic:cNvPr id="1124665155" name=""/>
+                    <pic:cNvPicPr/>
                   </pic:nvPicPr>
                   <pic:blipFill>
-                    <a:blip r:link="rId10">
-                      <a:extLst>
-                        <a:ext uri="{28A0092B-C50C-407E-A947-70E740481C1C}">
-                          <a14:useLocalDpi xmlns:a14="http://schemas.microsoft.com/office/drawing/2010/main" val="0"/>
-                        </a:ext>
-                      </a:extLst>
-                    </a:blip>
-                    <a:srcRect/>
+                    <a:blip r:embed="rId10"/>
                     <a:stretch>
                       <a:fillRect/>
                     </a:stretch>
                   </pic:blipFill>
-                  <pic:spPr bwMode="auto">
+                  <pic:spPr>
                     <a:xfrm>
                       <a:off x="0" y="0"/>
-                      <a:ext cx="3378200" cy="2108200"/>
+                      <a:ext cx="8257540" cy="5161280"/>
                     </a:xfrm>
                     <a:prstGeom prst="rect">
                       <a:avLst/>
                     </a:prstGeom>
-                    <a:noFill/>
-                    <a:ln>
-                      <a:noFill/>
-                    </a:ln>
                   </pic:spPr>
                 </pic:pic>
               </a:graphicData>
             </a:graphic>
           </wp:inline>
         </w:drawing>
-      </w:r>
-      <w:r>
-        <w:rPr>
-          <w:sz w:val="20"/>
-          <w:szCs w:val="20"/>
-        </w:rPr>
-        <w:fldChar w:fldCharType="end"/>
       </w:r>
       <w:r>
         <w:rPr>
@@ -20613,36 +20400,16 @@
       </w:pPr>
       <w:r>
         <w:rPr>
-          <w:sz w:val="20"/>
-          <w:szCs w:val="20"/>
-        </w:rPr>
-        <w:fldChar w:fldCharType="begin"/>
-      </w:r>
-      <w:r>
-        <w:rPr>
-          <w:sz w:val="20"/>
-          <w:szCs w:val="20"/>
-        </w:rPr>
-        <w:instrText xml:space="preserve"> INCLUDEPICTURE  \d "/Users/pauljohnson/Library/CloudStorage/OneDrive-UniversityofGlasgow/Projects/thermotolerance/EliminateRabiesTrial/analysis_report/eliminate_rabies_trial_analysis_report_v1.0_figures/figureS2.tiff" \* MERGEFORMATINET </w:instrText>
-      </w:r>
-      <w:r>
-        <w:rPr>
-          <w:sz w:val="20"/>
-          <w:szCs w:val="20"/>
-        </w:rPr>
-        <w:fldChar w:fldCharType="separate"/>
-      </w:r>
-      <w:r>
-        <w:rPr>
           <w:noProof/>
           <w:sz w:val="20"/>
           <w:szCs w:val="20"/>
         </w:rPr>
+        <w:lastRenderedPageBreak/>
         <w:drawing>
-          <wp:inline distT="0" distB="0" distL="0" distR="0" wp14:anchorId="02232EF9" wp14:editId="1ACDBE5B">
-            <wp:extent cx="3378200" cy="2108200"/>
+          <wp:inline distT="0" distB="0" distL="0" distR="0" wp14:anchorId="717BFAB9" wp14:editId="396F54E4">
+            <wp:extent cx="8257540" cy="5161280"/>
             <wp:effectExtent l="0" t="0" r="0" b="0"/>
-            <wp:docPr id="6" name="Picture 6"/>
+            <wp:docPr id="166875397" name="Picture 1"/>
             <wp:cNvGraphicFramePr>
               <a:graphicFrameLocks xmlns:a="http://schemas.openxmlformats.org/drawingml/2006/main" noChangeAspect="1"/>
             </wp:cNvGraphicFramePr>
@@ -20650,49 +20417,29 @@
               <a:graphicData uri="http://schemas.openxmlformats.org/drawingml/2006/picture">
                 <pic:pic xmlns:pic="http://schemas.openxmlformats.org/drawingml/2006/picture">
                   <pic:nvPicPr>
-                    <pic:cNvPr id="0" name="Picture 6"/>
-                    <pic:cNvPicPr>
-                      <a:picLocks noChangeAspect="1" noChangeArrowheads="1"/>
-                    </pic:cNvPicPr>
+                    <pic:cNvPr id="166875397" name=""/>
+                    <pic:cNvPicPr/>
                   </pic:nvPicPr>
                   <pic:blipFill>
-                    <a:blip r:link="rId11">
-                      <a:extLst>
-                        <a:ext uri="{28A0092B-C50C-407E-A947-70E740481C1C}">
-                          <a14:useLocalDpi xmlns:a14="http://schemas.microsoft.com/office/drawing/2010/main" val="0"/>
-                        </a:ext>
-                      </a:extLst>
-                    </a:blip>
-                    <a:srcRect/>
+                    <a:blip r:embed="rId11"/>
                     <a:stretch>
                       <a:fillRect/>
                     </a:stretch>
                   </pic:blipFill>
-                  <pic:spPr bwMode="auto">
+                  <pic:spPr>
                     <a:xfrm>
                       <a:off x="0" y="0"/>
-                      <a:ext cx="3378200" cy="2108200"/>
+                      <a:ext cx="8257540" cy="5161280"/>
                     </a:xfrm>
                     <a:prstGeom prst="rect">
                       <a:avLst/>
                     </a:prstGeom>
-                    <a:noFill/>
-                    <a:ln>
-                      <a:noFill/>
-                    </a:ln>
                   </pic:spPr>
                 </pic:pic>
               </a:graphicData>
             </a:graphic>
           </wp:inline>
         </w:drawing>
-      </w:r>
-      <w:r>
-        <w:rPr>
-          <w:sz w:val="20"/>
-          <w:szCs w:val="20"/>
-        </w:rPr>
-        <w:fldChar w:fldCharType="end"/>
       </w:r>
       <w:r>
         <w:rPr>

</xml_diff>